<commit_message>
Split documentation by two authors with per-section markers
Co-authored-by: Dudzinska <Dudzinska@users.noreply.github.com>
</commit_message>
<xml_diff>
--- a/docs/DOKUMENTACJA_PROJEKTU.docx
+++ b/docs/DOKUMENTACJA_PROJEKTU.docx
@@ -28,7 +28,7 @@
         </w:p>
       </w:sdtContent>
     </w:sdt>
-    <w:bookmarkStart w:id="62" w:name="dokumentacja-projektu"/>
+    <w:bookmarkStart w:id="65" w:name="dokumentacja-projektu"/>
     <w:p>
       <w:pPr>
         <w:pStyle w:val="Heading1"/>
@@ -62,246 +62,7 @@
         <w:pStyle w:val="BodyText"/>
       </w:pPr>
       <w:r>
-        <w:t xml:space="preserve">Autor: [Imię i nazwisko]</w:t>
-      </w:r>
-    </w:p>
-    <w:p>
-      <w:pPr>
-        <w:pStyle w:val="BodyText"/>
-      </w:pPr>
-      <w:r>
-        <w:t xml:space="preserve">Nr indeksu: [Nr indeksu]</w:t>
-      </w:r>
-    </w:p>
-    <w:p>
-      <w:pPr>
-        <w:pStyle w:val="BodyText"/>
-      </w:pPr>
-      <w:r>
-        <w:t xml:space="preserve">Projekt grupowy</w:t>
-      </w:r>
-    </w:p>
-    <w:p>
-      <w:pPr>
-        <w:pStyle w:val="BodyText"/>
-      </w:pPr>
-      <w:r>
-        <w:t xml:space="preserve">Zakres dokumentacji: moduły autora (backend, baza danych, logika biznesowa, wybrane elementy frontendu)</w:t>
-      </w:r>
-    </w:p>
-    <w:p>
-      <w:pPr>
-        <w:pStyle w:val="BodyText"/>
-      </w:pPr>
-      <w:r>
-        <w:t xml:space="preserve">Data: czerwiec 2026</w:t>
-      </w:r>
-    </w:p>
-    <w:p>
-      <w:r>
-        <w:pict>
-          <v:rect style="width:0;height:1.5pt" o:hralign="center" o:hrstd="t" o:hr="t"/>
-        </w:pict>
-      </w:r>
-    </w:p>
-    <w:bookmarkStart w:id="22" w:name="wprowadzenie-cel-aplikacji"/>
-    <w:p>
-      <w:pPr>
-        <w:pStyle w:val="Heading2"/>
-      </w:pPr>
-      <w:r>
-        <w:t xml:space="preserve">1. Wprowadzenie — cel aplikacji</w:t>
-      </w:r>
-    </w:p>
-    <w:p>
-      <w:pPr>
-        <w:pStyle w:val="FirstParagraph"/>
-      </w:pPr>
-      <w:r>
-        <w:t xml:space="preserve">BillsBuddy to aplikacja webowa, która pozwala grupie osób (np. współlokatorom, znajomym z wycieczki, rodzinie) wspólnie zapisywać poniesione wydatki i automatycznie wyliczać, kto komu ile jest winien. Użytkownik tworzy grupę, zaprasza do niej uczestników po adresie e-mail, dodaje rachunki (kto zapłacił i ile), a aplikacja sama dzieli koszty po równo, wylicza salda każdej osoby i proponuje minimalny zestaw przelewów, które zamykają wszystkie długi. Aplikacja zawiera również publiczny katalog grup (dla zalogowanych), statystyki wydatków oraz panel administratora.</w:t>
-      </w:r>
-    </w:p>
-    <w:bookmarkStart w:id="20" w:name="pytania-pomocnicze"/>
-    <w:p>
-      <w:pPr>
-        <w:pStyle w:val="Heading3"/>
-      </w:pPr>
-      <w:r>
-        <w:t xml:space="preserve">1.1. Pytania pomocnicze</w:t>
-      </w:r>
-    </w:p>
-    <w:p>
-      <w:pPr>
-        <w:pStyle w:val="FirstParagraph"/>
-      </w:pPr>
-      <w:r>
-        <w:rPr>
-          <w:bCs/>
-          <w:b/>
-        </w:rPr>
-        <w:t xml:space="preserve">1. Jaki problem rozwiązuje nasza aplikacja?</w:t>
-      </w:r>
-    </w:p>
-    <w:p>
-      <w:pPr>
-        <w:pStyle w:val="BodyText"/>
-      </w:pPr>
-      <w:r>
-        <w:t xml:space="preserve">Gdy grupa osób ponosi wspólne wydatki (wspólne zakupy, wyjazd, mieszkanie), trudno na bieżąco pamiętać, kto za co zapłacił i jak się rozliczyć na koniec. Ręczne liczenie na kartce jest podatne na błędy, a liczba przelewów „każdy każdemu” szybko rośnie. BillsBuddy gromadzi wszystkie rachunki w jednym miejscu, automatycznie dzieli koszty i mówi wprost: „Adam przelej Oliwii 200 zł” — zamiast wielu drobnych przelewów wykonuje się tylko niezbędne.</w:t>
-      </w:r>
-    </w:p>
-    <w:p>
-      <w:pPr>
-        <w:pStyle w:val="BodyText"/>
-      </w:pPr>
-      <w:r>
-        <w:rPr>
-          <w:bCs/>
-          <w:b/>
-        </w:rPr>
-        <w:t xml:space="preserve">2. Czym wyróżnia się BillsBuddy wobec podobnych rozwiązań?</w:t>
-      </w:r>
-    </w:p>
-    <w:p>
-      <w:pPr>
-        <w:pStyle w:val="BodyText"/>
-      </w:pPr>
-      <w:r>
-        <w:t xml:space="preserve">W odróżnieniu od zwykłego arkusza kalkulacyjnego BillsBuddy:</w:t>
-      </w:r>
-      <w:r>
-        <w:t xml:space="preserve"> </w:t>
-      </w:r>
-      <w:r>
-        <w:t xml:space="preserve">- automatycznie wylicza</w:t>
-      </w:r>
-      <w:r>
-        <w:t xml:space="preserve"> </w:t>
-      </w:r>
-      <w:r>
-        <w:rPr>
-          <w:bCs/>
-          <w:b/>
-        </w:rPr>
-        <w:t xml:space="preserve">plan rozliczeń minimalizujący liczbę przelewów</w:t>
-      </w:r>
-      <w:r>
-        <w:t xml:space="preserve"> </w:t>
-      </w:r>
-      <w:r>
-        <w:t xml:space="preserve">(algorytm dłużnik–wierzyciel),</w:t>
-      </w:r>
-      <w:r>
-        <w:t xml:space="preserve"> </w:t>
-      </w:r>
-      <w:r>
-        <w:t xml:space="preserve">- pozwala rozbić rachunek na</w:t>
-      </w:r>
-      <w:r>
-        <w:t xml:space="preserve"> </w:t>
-      </w:r>
-      <w:r>
-        <w:rPr>
-          <w:bCs/>
-          <w:b/>
-        </w:rPr>
-        <w:t xml:space="preserve">pozycje z paragonu</w:t>
-      </w:r>
-      <w:r>
-        <w:t xml:space="preserve"> </w:t>
-      </w:r>
-      <w:r>
-        <w:t xml:space="preserve">i automatycznie przeliczyć podział,</w:t>
-      </w:r>
-      <w:r>
-        <w:t xml:space="preserve"> </w:t>
-      </w:r>
-      <w:r>
-        <w:t xml:space="preserve">- pokazuje</w:t>
-      </w:r>
-      <w:r>
-        <w:t xml:space="preserve"> </w:t>
-      </w:r>
-      <w:r>
-        <w:rPr>
-          <w:bCs/>
-          <w:b/>
-        </w:rPr>
-        <w:t xml:space="preserve">salda i statystyki wydatków</w:t>
-      </w:r>
-      <w:r>
-        <w:t xml:space="preserve"> </w:t>
-      </w:r>
-      <w:r>
-        <w:t xml:space="preserve">grupy w czasie rzeczywistym,</w:t>
-      </w:r>
-      <w:r>
-        <w:t xml:space="preserve"> </w:t>
-      </w:r>
-      <w:r>
-        <w:t xml:space="preserve">- udostępnia</w:t>
-      </w:r>
-      <w:r>
-        <w:t xml:space="preserve"> </w:t>
-      </w:r>
-      <w:r>
-        <w:rPr>
-          <w:bCs/>
-          <w:b/>
-        </w:rPr>
-        <w:t xml:space="preserve">publiczny katalog grup</w:t>
-      </w:r>
-      <w:r>
-        <w:t xml:space="preserve"> </w:t>
-      </w:r>
-      <w:r>
-        <w:t xml:space="preserve">z filtrowaniem i sortowaniem,</w:t>
-      </w:r>
-      <w:r>
-        <w:t xml:space="preserve"> </w:t>
-      </w:r>
-      <w:r>
-        <w:t xml:space="preserve">- rozdziela</w:t>
-      </w:r>
-      <w:r>
-        <w:t xml:space="preserve"> </w:t>
-      </w:r>
-      <w:r>
-        <w:rPr>
-          <w:bCs/>
-          <w:b/>
-        </w:rPr>
-        <w:t xml:space="preserve">role admin/user</w:t>
-      </w:r>
-      <w:r>
-        <w:t xml:space="preserve"> </w:t>
-      </w:r>
-      <w:r>
-        <w:t xml:space="preserve">oraz chroni zasoby kontrolą dostępu,</w:t>
-      </w:r>
-      <w:r>
-        <w:t xml:space="preserve"> </w:t>
-      </w:r>
-      <w:r>
-        <w:t xml:space="preserve">- ma responsywny interfejs z motywem jasnym/ciemnym (Tailwind CSS + Alpine.js).</w:t>
-      </w:r>
-    </w:p>
-    <w:bookmarkEnd w:id="20"/>
-    <w:bookmarkStart w:id="21" w:name="X42db85c6a7927bddd18412157f2aadfc458305e"/>
-    <w:p>
-      <w:pPr>
-        <w:pStyle w:val="Heading3"/>
-      </w:pPr>
-      <w:r>
-        <w:t xml:space="preserve">1.2. Zakres odpowiedzialności autora dokumentacji</w:t>
-      </w:r>
-    </w:p>
-    <w:p>
-      <w:pPr>
-        <w:pStyle w:val="FirstParagraph"/>
-      </w:pPr>
-      <w:r>
-        <w:t xml:space="preserve">Dokument opisuje moduły zaimplementowane głównie przez autora tej dokumentacji w ramach pracy grupowej (backend Laravel, baza danych, logika serwera, formularze i interakcje frontendowe powiązane z poniższymi funkcjami):</w:t>
+        <w:t xml:space="preserve">Projekt grupowy — 2 osoby</w:t>
       </w:r>
     </w:p>
     <w:p>
@@ -313,7 +74,17 @@
         <w:pStyle w:val="Compact"/>
       </w:pPr>
       <w:r>
-        <w:t xml:space="preserve">CRUD grup rozliczeniowych (tworzenie, lista, edycja, usuwanie) z walidacją po stronie serwera i klienta.</w:t>
+        <w:rPr>
+          <w:bCs/>
+          <w:b/>
+        </w:rPr>
+        <w:t xml:space="preserve">Osoba 1:</w:t>
+      </w:r>
+      <w:r>
+        <w:t xml:space="preserve"> </w:t>
+      </w:r>
+      <w:r>
+        <w:t xml:space="preserve">[Imię i nazwisko], nr indeksu [Nr indeksu] — moduł „Konta, grupy i administracja”</w:t>
       </w:r>
     </w:p>
     <w:p>
@@ -325,100 +96,96 @@
         <w:pStyle w:val="Compact"/>
       </w:pPr>
       <w:r>
-        <w:t xml:space="preserve">Dodawanie rachunków i pozycji z paragonu wraz z walidacją kwot.</w:t>
-      </w:r>
-    </w:p>
-    <w:p>
-      <w:pPr>
-        <w:numPr>
-          <w:ilvl w:val="0"/>
-          <w:numId w:val="1001"/>
-        </w:numPr>
-        <w:pStyle w:val="Compact"/>
-      </w:pPr>
-      <w:r>
-        <w:t xml:space="preserve">Algorytm planu rozliczeń minimalizujący liczbę przelewów (</w:t>
-      </w:r>
-      <w:r>
-        <w:rPr>
-          <w:rStyle w:val="VerbatimChar"/>
-        </w:rPr>
-        <w:t xml:space="preserve">Group::getSettlementPlan()</w:t>
-      </w:r>
-      <w:r>
-        <w:t xml:space="preserve">).</w:t>
-      </w:r>
-    </w:p>
-    <w:p>
-      <w:pPr>
-        <w:numPr>
-          <w:ilvl w:val="0"/>
-          <w:numId w:val="1001"/>
-        </w:numPr>
-        <w:pStyle w:val="Compact"/>
-      </w:pPr>
-      <w:r>
-        <w:t xml:space="preserve">Automatyczne dzielenie kosztów (po równo oraz na podstawie pozycji paragonu) —</w:t>
-      </w:r>
-      <w:r>
-        <w:t xml:space="preserve"> </w:t>
-      </w:r>
-      <w:r>
-        <w:rPr>
-          <w:rStyle w:val="VerbatimChar"/>
-        </w:rPr>
-        <w:t xml:space="preserve">BillSplitService</w:t>
-      </w:r>
-      <w:r>
-        <w:t xml:space="preserve">.</w:t>
-      </w:r>
-    </w:p>
-    <w:p>
-      <w:pPr>
-        <w:numPr>
-          <w:ilvl w:val="0"/>
-          <w:numId w:val="1001"/>
-        </w:numPr>
-        <w:pStyle w:val="Compact"/>
-      </w:pPr>
-      <w:r>
-        <w:t xml:space="preserve">Statystyki wydatków grupy (bieżący miesiąc, ostatnie 30 dni, najwyższy/średni rachunek).</w:t>
-      </w:r>
-    </w:p>
-    <w:p>
-      <w:pPr>
-        <w:numPr>
-          <w:ilvl w:val="0"/>
-          <w:numId w:val="1001"/>
-        </w:numPr>
-        <w:pStyle w:val="Compact"/>
-      </w:pPr>
-      <w:r>
-        <w:t xml:space="preserve">Publiczny katalog grup z filtrowaniem i sortowaniem.</w:t>
-      </w:r>
-    </w:p>
-    <w:p>
-      <w:pPr>
-        <w:numPr>
-          <w:ilvl w:val="0"/>
-          <w:numId w:val="1001"/>
-        </w:numPr>
-        <w:pStyle w:val="Compact"/>
-      </w:pPr>
-      <w:r>
-        <w:t xml:space="preserve">Panel administratora: zarządzanie kontami i rolami użytkowników.</w:t>
-      </w:r>
-    </w:p>
-    <w:p>
-      <w:pPr>
-        <w:numPr>
-          <w:ilvl w:val="0"/>
-          <w:numId w:val="1001"/>
-        </w:numPr>
-        <w:pStyle w:val="Compact"/>
-      </w:pPr>
-      <w:r>
-        <w:t xml:space="preserve">Seeder danych testowych (użytkownicy, grupa, rachunek, podział kosztów).</w:t>
+        <w:rPr>
+          <w:bCs/>
+          <w:b/>
+        </w:rPr>
+        <w:t xml:space="preserve">Osoba 2:</w:t>
+      </w:r>
+      <w:r>
+        <w:t xml:space="preserve"> </w:t>
+      </w:r>
+      <w:r>
+        <w:t xml:space="preserve">[Imię i nazwisko], nr indeksu [Nr indeksu] — moduł „Rachunki i rozliczenia”</w:t>
+      </w:r>
+    </w:p>
+    <w:p>
+      <w:pPr>
+        <w:pStyle w:val="FirstParagraph"/>
+      </w:pPr>
+      <w:r>
+        <w:t xml:space="preserve">Zakres dokumentacji: backend, baza danych, logika biznesowa oraz wybrane elementy frontendu, z wyraźnym oznaczeniem wkładu każdej z dwóch osób.</w:t>
+      </w:r>
+    </w:p>
+    <w:p>
+      <w:pPr>
+        <w:pStyle w:val="BodyText"/>
+      </w:pPr>
+      <w:r>
+        <w:t xml:space="preserve">Data: czerwiec 2026</w:t>
+      </w:r>
+    </w:p>
+    <w:p>
+      <w:pPr>
+        <w:pStyle w:val="BlockText"/>
+      </w:pPr>
+      <w:r>
+        <w:rPr>
+          <w:bCs/>
+          <w:b/>
+        </w:rPr>
+        <w:t xml:space="preserve">Legenda oznaczeń wkładu:</w:t>
+      </w:r>
+      <w:r>
+        <w:t xml:space="preserve"> </w:t>
+      </w:r>
+      <w:r>
+        <w:t xml:space="preserve">przy każdej sekcji w nawiasie podano osobę odpowiedzialną —</w:t>
+      </w:r>
+      <w:r>
+        <w:t xml:space="preserve"> </w:t>
+      </w:r>
+      <w:r>
+        <w:rPr>
+          <w:bCs/>
+          <w:b/>
+        </w:rPr>
+        <w:t xml:space="preserve">(Osoba 1)</w:t>
+      </w:r>
+      <w:r>
+        <w:t xml:space="preserve">,</w:t>
+      </w:r>
+      <w:r>
+        <w:t xml:space="preserve"> </w:t>
+      </w:r>
+      <w:r>
+        <w:rPr>
+          <w:bCs/>
+          <w:b/>
+        </w:rPr>
+        <w:t xml:space="preserve">(Osoba 2)</w:t>
+      </w:r>
+      <w:r>
+        <w:t xml:space="preserve"> </w:t>
+      </w:r>
+      <w:r>
+        <w:t xml:space="preserve">lub</w:t>
+      </w:r>
+      <w:r>
+        <w:t xml:space="preserve"> </w:t>
+      </w:r>
+      <w:r>
+        <w:rPr>
+          <w:bCs/>
+          <w:b/>
+        </w:rPr>
+        <w:t xml:space="preserve">(Osoba 1 + Osoba 2)</w:t>
+      </w:r>
+      <w:r>
+        <w:t xml:space="preserve"> </w:t>
+      </w:r>
+      <w:r>
+        <w:t xml:space="preserve">dla części wspólnych.</w:t>
       </w:r>
     </w:p>
     <w:p>
@@ -428,18 +195,977 @@
         </w:pict>
       </w:r>
     </w:p>
+    <w:bookmarkStart w:id="25" w:name="wprowadzenie-cel-aplikacji"/>
+    <w:p>
+      <w:pPr>
+        <w:pStyle w:val="Heading2"/>
+      </w:pPr>
+      <w:r>
+        <w:t xml:space="preserve">1. Wprowadzenie — cel aplikacji</w:t>
+      </w:r>
+    </w:p>
+    <w:p>
+      <w:pPr>
+        <w:pStyle w:val="FirstParagraph"/>
+      </w:pPr>
+      <w:r>
+        <w:t xml:space="preserve">BillsBuddy to aplikacja webowa, która pozwala grupie osób (np. współlokatorom, znajomym z wycieczki, rodzinie) wspólnie zapisywać poniesione wydatki i automatycznie wyliczać, kto komu ile jest winien. Użytkownik tworzy grupę, zaprasza do niej uczestników po adresie e-mail, dodaje rachunki (kto zapłacił i ile), a aplikacja sama dzieli koszty po równo, wylicza salda każdej osoby i proponuje minimalny zestaw przelewów, które zamykają wszystkie długi. Aplikacja zawiera również publiczny katalog grup (dla zalogowanych), statystyki wydatków oraz panel administratora.</w:t>
+      </w:r>
+    </w:p>
+    <w:bookmarkStart w:id="20" w:name="pytania-pomocnicze"/>
+    <w:p>
+      <w:pPr>
+        <w:pStyle w:val="Heading3"/>
+      </w:pPr>
+      <w:r>
+        <w:t xml:space="preserve">1.1. Pytania pomocnicze</w:t>
+      </w:r>
+    </w:p>
+    <w:p>
+      <w:pPr>
+        <w:pStyle w:val="FirstParagraph"/>
+      </w:pPr>
+      <w:r>
+        <w:rPr>
+          <w:bCs/>
+          <w:b/>
+        </w:rPr>
+        <w:t xml:space="preserve">1. Jaki problem rozwiązuje nasza aplikacja?</w:t>
+      </w:r>
+    </w:p>
+    <w:p>
+      <w:pPr>
+        <w:pStyle w:val="BodyText"/>
+      </w:pPr>
+      <w:r>
+        <w:t xml:space="preserve">Gdy grupa osób ponosi wspólne wydatki (wspólne zakupy, wyjazd, mieszkanie), trudno na bieżąco pamiętać, kto za co zapłacił i jak się rozliczyć na koniec. Ręczne liczenie na kartce jest podatne na błędy, a liczba przelewów „każdy każdemu” szybko rośnie. BillsBuddy gromadzi wszystkie rachunki w jednym miejscu, automatycznie dzieli koszty i mówi wprost: „Adam przelej Oliwii 200 zł” — zamiast wielu drobnych przelewów wykonuje się tylko niezbędne.</w:t>
+      </w:r>
+    </w:p>
+    <w:p>
+      <w:pPr>
+        <w:pStyle w:val="BodyText"/>
+      </w:pPr>
+      <w:r>
+        <w:rPr>
+          <w:bCs/>
+          <w:b/>
+        </w:rPr>
+        <w:t xml:space="preserve">2. Czym wyróżnia się BillsBuddy wobec podobnych rozwiązań?</w:t>
+      </w:r>
+    </w:p>
+    <w:p>
+      <w:pPr>
+        <w:pStyle w:val="BodyText"/>
+      </w:pPr>
+      <w:r>
+        <w:t xml:space="preserve">W odróżnieniu od zwykłego arkusza kalkulacyjnego BillsBuddy:</w:t>
+      </w:r>
+      <w:r>
+        <w:t xml:space="preserve"> </w:t>
+      </w:r>
+      <w:r>
+        <w:t xml:space="preserve">- automatycznie wylicza</w:t>
+      </w:r>
+      <w:r>
+        <w:t xml:space="preserve"> </w:t>
+      </w:r>
+      <w:r>
+        <w:rPr>
+          <w:bCs/>
+          <w:b/>
+        </w:rPr>
+        <w:t xml:space="preserve">plan rozliczeń minimalizujący liczbę przelewów</w:t>
+      </w:r>
+      <w:r>
+        <w:t xml:space="preserve"> </w:t>
+      </w:r>
+      <w:r>
+        <w:t xml:space="preserve">(algorytm dłużnik–wierzyciel),</w:t>
+      </w:r>
+      <w:r>
+        <w:t xml:space="preserve"> </w:t>
+      </w:r>
+      <w:r>
+        <w:t xml:space="preserve">- pozwala rozbić rachunek na</w:t>
+      </w:r>
+      <w:r>
+        <w:t xml:space="preserve"> </w:t>
+      </w:r>
+      <w:r>
+        <w:rPr>
+          <w:bCs/>
+          <w:b/>
+        </w:rPr>
+        <w:t xml:space="preserve">pozycje z paragonu</w:t>
+      </w:r>
+      <w:r>
+        <w:t xml:space="preserve"> </w:t>
+      </w:r>
+      <w:r>
+        <w:t xml:space="preserve">i automatycznie przeliczyć podział,</w:t>
+      </w:r>
+      <w:r>
+        <w:t xml:space="preserve"> </w:t>
+      </w:r>
+      <w:r>
+        <w:t xml:space="preserve">- pokazuje</w:t>
+      </w:r>
+      <w:r>
+        <w:t xml:space="preserve"> </w:t>
+      </w:r>
+      <w:r>
+        <w:rPr>
+          <w:bCs/>
+          <w:b/>
+        </w:rPr>
+        <w:t xml:space="preserve">salda i statystyki wydatków</w:t>
+      </w:r>
+      <w:r>
+        <w:t xml:space="preserve"> </w:t>
+      </w:r>
+      <w:r>
+        <w:t xml:space="preserve">grupy w czasie rzeczywistym,</w:t>
+      </w:r>
+      <w:r>
+        <w:t xml:space="preserve"> </w:t>
+      </w:r>
+      <w:r>
+        <w:t xml:space="preserve">- udostępnia</w:t>
+      </w:r>
+      <w:r>
+        <w:t xml:space="preserve"> </w:t>
+      </w:r>
+      <w:r>
+        <w:rPr>
+          <w:bCs/>
+          <w:b/>
+        </w:rPr>
+        <w:t xml:space="preserve">publiczny katalog grup</w:t>
+      </w:r>
+      <w:r>
+        <w:t xml:space="preserve"> </w:t>
+      </w:r>
+      <w:r>
+        <w:t xml:space="preserve">z filtrowaniem i sortowaniem,</w:t>
+      </w:r>
+      <w:r>
+        <w:t xml:space="preserve"> </w:t>
+      </w:r>
+      <w:r>
+        <w:t xml:space="preserve">- rozdziela</w:t>
+      </w:r>
+      <w:r>
+        <w:t xml:space="preserve"> </w:t>
+      </w:r>
+      <w:r>
+        <w:rPr>
+          <w:bCs/>
+          <w:b/>
+        </w:rPr>
+        <w:t xml:space="preserve">role admin/user</w:t>
+      </w:r>
+      <w:r>
+        <w:t xml:space="preserve"> </w:t>
+      </w:r>
+      <w:r>
+        <w:t xml:space="preserve">oraz chroni zasoby kontrolą dostępu,</w:t>
+      </w:r>
+      <w:r>
+        <w:t xml:space="preserve"> </w:t>
+      </w:r>
+      <w:r>
+        <w:t xml:space="preserve">- ma responsywny interfejs z motywem jasnym/ciemnym (Tailwind CSS + Alpine.js).</w:t>
+      </w:r>
+    </w:p>
+    <w:bookmarkEnd w:id="20"/>
+    <w:bookmarkStart w:id="24" w:name="podział-pracy-w-zespole-2-osoby"/>
+    <w:p>
+      <w:pPr>
+        <w:pStyle w:val="Heading3"/>
+      </w:pPr>
+      <w:r>
+        <w:t xml:space="preserve">1.2. Podział pracy w zespole (2 osoby)</w:t>
+      </w:r>
+    </w:p>
+    <w:p>
+      <w:pPr>
+        <w:pStyle w:val="FirstParagraph"/>
+      </w:pPr>
+      <w:r>
+        <w:t xml:space="preserve">Projekt powstał w dwuosobowym zespole. Praca została podzielona według obszarów funkcjonalnych:</w:t>
+      </w:r>
+    </w:p>
+    <w:tbl>
+      <w:tblPr>
+        <w:tblStyle w:val="Table"/>
+        <w:tblW w:type="pct" w:w="5000"/>
+        <w:tblLook w:firstRow="1" w:lastRow="0" w:firstColumn="0" w:lastColumn="0" w:noHBand="0" w:noVBand="0" w:val="0020"/>
+        <w:jc w:val="start"/>
+      </w:tblPr>
+      <w:tblGrid>
+        <w:gridCol w:w="772"/>
+        <w:gridCol w:w="3863"/>
+        <w:gridCol w:w="3283"/>
+      </w:tblGrid>
+      <w:tr>
+        <w:trPr>
+          <w:tblHeader w:val="true"/>
+        </w:trPr>
+        <w:tc>
+          <w:tcPr/>
+          <w:p>
+            <w:pPr>
+              <w:pStyle w:val="Compact"/>
+              <w:jc w:val="left"/>
+            </w:pPr>
+            <w:r>
+              <w:t xml:space="preserve">Obszar</w:t>
+            </w:r>
+          </w:p>
+        </w:tc>
+        <w:tc>
+          <w:tcPr/>
+          <w:p>
+            <w:pPr>
+              <w:pStyle w:val="Compact"/>
+              <w:jc w:val="left"/>
+            </w:pPr>
+            <w:r>
+              <w:t xml:space="preserve">Osoba 1 — Konta, grupy i administracja</w:t>
+            </w:r>
+          </w:p>
+        </w:tc>
+        <w:tc>
+          <w:tcPr/>
+          <w:p>
+            <w:pPr>
+              <w:pStyle w:val="Compact"/>
+              <w:jc w:val="left"/>
+            </w:pPr>
+            <w:r>
+              <w:t xml:space="preserve">Osoba 2 — Rachunki i rozliczenia</w:t>
+            </w:r>
+          </w:p>
+        </w:tc>
+      </w:tr>
+      <w:tr>
+        <w:tc>
+          <w:tcPr/>
+          <w:p>
+            <w:pPr>
+              <w:pStyle w:val="Compact"/>
+              <w:jc w:val="left"/>
+            </w:pPr>
+            <w:r>
+              <w:t xml:space="preserve">Backend (kontrolery)</w:t>
+            </w:r>
+          </w:p>
+        </w:tc>
+        <w:tc>
+          <w:tcPr/>
+          <w:p>
+            <w:pPr>
+              <w:pStyle w:val="Compact"/>
+              <w:jc w:val="left"/>
+            </w:pPr>
+            <w:r>
+              <w:rPr>
+                <w:rStyle w:val="VerbatimChar"/>
+              </w:rPr>
+              <w:t xml:space="preserve">GroupController</w:t>
+            </w:r>
+            <w:r>
+              <w:t xml:space="preserve">,</w:t>
+            </w:r>
+            <w:r>
+              <w:t xml:space="preserve"> </w:t>
+            </w:r>
+            <w:r>
+              <w:rPr>
+                <w:rStyle w:val="VerbatimChar"/>
+              </w:rPr>
+              <w:t xml:space="preserve">PublicGroupController</w:t>
+            </w:r>
+            <w:r>
+              <w:t xml:space="preserve">,</w:t>
+            </w:r>
+            <w:r>
+              <w:t xml:space="preserve"> </w:t>
+            </w:r>
+            <w:r>
+              <w:rPr>
+                <w:rStyle w:val="VerbatimChar"/>
+              </w:rPr>
+              <w:t xml:space="preserve">Admin\UserController</w:t>
+            </w:r>
+            <w:r>
+              <w:t xml:space="preserve">,</w:t>
+            </w:r>
+            <w:r>
+              <w:t xml:space="preserve"> </w:t>
+            </w:r>
+            <w:r>
+              <w:rPr>
+                <w:rStyle w:val="VerbatimChar"/>
+              </w:rPr>
+              <w:t xml:space="preserve">ProfileController</w:t>
+            </w:r>
+          </w:p>
+        </w:tc>
+        <w:tc>
+          <w:tcPr/>
+          <w:p>
+            <w:pPr>
+              <w:pStyle w:val="Compact"/>
+              <w:jc w:val="left"/>
+            </w:pPr>
+            <w:r>
+              <w:rPr>
+                <w:rStyle w:val="VerbatimChar"/>
+              </w:rPr>
+              <w:t xml:space="preserve">BillController</w:t>
+            </w:r>
+            <w:r>
+              <w:t xml:space="preserve">,</w:t>
+            </w:r>
+            <w:r>
+              <w:t xml:space="preserve"> </w:t>
+            </w:r>
+            <w:r>
+              <w:rPr>
+                <w:rStyle w:val="VerbatimChar"/>
+              </w:rPr>
+              <w:t xml:space="preserve">BillItemController</w:t>
+            </w:r>
+            <w:r>
+              <w:t xml:space="preserve">,</w:t>
+            </w:r>
+            <w:r>
+              <w:t xml:space="preserve"> </w:t>
+            </w:r>
+            <w:r>
+              <w:rPr>
+                <w:rStyle w:val="VerbatimChar"/>
+              </w:rPr>
+              <w:t xml:space="preserve">BillSplitService</w:t>
+            </w:r>
+          </w:p>
+        </w:tc>
+      </w:tr>
+      <w:tr>
+        <w:tc>
+          <w:tcPr/>
+          <w:p>
+            <w:pPr>
+              <w:pStyle w:val="Compact"/>
+              <w:jc w:val="left"/>
+            </w:pPr>
+            <w:r>
+              <w:t xml:space="preserve">Modele</w:t>
+            </w:r>
+          </w:p>
+        </w:tc>
+        <w:tc>
+          <w:tcPr/>
+          <w:p>
+            <w:pPr>
+              <w:pStyle w:val="Compact"/>
+              <w:jc w:val="left"/>
+            </w:pPr>
+            <w:r>
+              <w:rPr>
+                <w:rStyle w:val="VerbatimChar"/>
+              </w:rPr>
+              <w:t xml:space="preserve">User</w:t>
+            </w:r>
+            <w:r>
+              <w:t xml:space="preserve">,</w:t>
+            </w:r>
+            <w:r>
+              <w:t xml:space="preserve"> </w:t>
+            </w:r>
+            <w:r>
+              <w:rPr>
+                <w:rStyle w:val="VerbatimChar"/>
+              </w:rPr>
+              <w:t xml:space="preserve">Group</w:t>
+            </w:r>
+            <w:r>
+              <w:t xml:space="preserve"> </w:t>
+            </w:r>
+            <w:r>
+              <w:t xml:space="preserve">(relacje i dostęp)</w:t>
+            </w:r>
+          </w:p>
+        </w:tc>
+        <w:tc>
+          <w:tcPr/>
+          <w:p>
+            <w:pPr>
+              <w:pStyle w:val="Compact"/>
+              <w:jc w:val="left"/>
+            </w:pPr>
+            <w:r>
+              <w:rPr>
+                <w:rStyle w:val="VerbatimChar"/>
+              </w:rPr>
+              <w:t xml:space="preserve">Bill</w:t>
+            </w:r>
+            <w:r>
+              <w:t xml:space="preserve">,</w:t>
+            </w:r>
+            <w:r>
+              <w:t xml:space="preserve"> </w:t>
+            </w:r>
+            <w:r>
+              <w:rPr>
+                <w:rStyle w:val="VerbatimChar"/>
+              </w:rPr>
+              <w:t xml:space="preserve">BillItem</w:t>
+            </w:r>
+            <w:r>
+              <w:t xml:space="preserve">,</w:t>
+            </w:r>
+            <w:r>
+              <w:t xml:space="preserve"> </w:t>
+            </w:r>
+            <w:r>
+              <w:rPr>
+                <w:rStyle w:val="VerbatimChar"/>
+              </w:rPr>
+              <w:t xml:space="preserve">BillSplit</w:t>
+            </w:r>
+            <w:r>
+              <w:t xml:space="preserve">, metody salda/planu w</w:t>
+            </w:r>
+            <w:r>
+              <w:t xml:space="preserve"> </w:t>
+            </w:r>
+            <w:r>
+              <w:rPr>
+                <w:rStyle w:val="VerbatimChar"/>
+              </w:rPr>
+              <w:t xml:space="preserve">Group</w:t>
+            </w:r>
+          </w:p>
+        </w:tc>
+      </w:tr>
+      <w:tr>
+        <w:tc>
+          <w:tcPr/>
+          <w:p>
+            <w:pPr>
+              <w:pStyle w:val="Compact"/>
+              <w:jc w:val="left"/>
+            </w:pPr>
+            <w:r>
+              <w:t xml:space="preserve">Logika biznesowa</w:t>
+            </w:r>
+          </w:p>
+        </w:tc>
+        <w:tc>
+          <w:tcPr/>
+          <w:p>
+            <w:pPr>
+              <w:pStyle w:val="Compact"/>
+              <w:jc w:val="left"/>
+            </w:pPr>
+            <w:r>
+              <w:t xml:space="preserve">role i kontrola dostępu, publiczny katalog z filtrami i sortowaniem</w:t>
+            </w:r>
+          </w:p>
+        </w:tc>
+        <w:tc>
+          <w:tcPr/>
+          <w:p>
+            <w:pPr>
+              <w:pStyle w:val="Compact"/>
+              <w:jc w:val="left"/>
+            </w:pPr>
+            <w:r>
+              <w:t xml:space="preserve">automatyczny podział kosztów, plan rozliczeń, statystyki wydatków</w:t>
+            </w:r>
+          </w:p>
+        </w:tc>
+      </w:tr>
+      <w:tr>
+        <w:tc>
+          <w:tcPr/>
+          <w:p>
+            <w:pPr>
+              <w:pStyle w:val="Compact"/>
+              <w:jc w:val="left"/>
+            </w:pPr>
+            <w:r>
+              <w:t xml:space="preserve">Baza danych (tabele)</w:t>
+            </w:r>
+          </w:p>
+        </w:tc>
+        <w:tc>
+          <w:tcPr/>
+          <w:p>
+            <w:pPr>
+              <w:pStyle w:val="Compact"/>
+              <w:jc w:val="left"/>
+            </w:pPr>
+            <w:r>
+              <w:rPr>
+                <w:rStyle w:val="VerbatimChar"/>
+              </w:rPr>
+              <w:t xml:space="preserve">users</w:t>
+            </w:r>
+            <w:r>
+              <w:t xml:space="preserve">,</w:t>
+            </w:r>
+            <w:r>
+              <w:t xml:space="preserve"> </w:t>
+            </w:r>
+            <w:r>
+              <w:rPr>
+                <w:rStyle w:val="VerbatimChar"/>
+              </w:rPr>
+              <w:t xml:space="preserve">groups</w:t>
+            </w:r>
+            <w:r>
+              <w:t xml:space="preserve">,</w:t>
+            </w:r>
+            <w:r>
+              <w:t xml:space="preserve"> </w:t>
+            </w:r>
+            <w:r>
+              <w:rPr>
+                <w:rStyle w:val="VerbatimChar"/>
+              </w:rPr>
+              <w:t xml:space="preserve">group_user</w:t>
+            </w:r>
+          </w:p>
+        </w:tc>
+        <w:tc>
+          <w:tcPr/>
+          <w:p>
+            <w:pPr>
+              <w:pStyle w:val="Compact"/>
+              <w:jc w:val="left"/>
+            </w:pPr>
+            <w:r>
+              <w:rPr>
+                <w:rStyle w:val="VerbatimChar"/>
+              </w:rPr>
+              <w:t xml:space="preserve">bills</w:t>
+            </w:r>
+            <w:r>
+              <w:t xml:space="preserve">,</w:t>
+            </w:r>
+            <w:r>
+              <w:t xml:space="preserve"> </w:t>
+            </w:r>
+            <w:r>
+              <w:rPr>
+                <w:rStyle w:val="VerbatimChar"/>
+              </w:rPr>
+              <w:t xml:space="preserve">bill_items</w:t>
+            </w:r>
+            <w:r>
+              <w:t xml:space="preserve">,</w:t>
+            </w:r>
+            <w:r>
+              <w:t xml:space="preserve"> </w:t>
+            </w:r>
+            <w:r>
+              <w:rPr>
+                <w:rStyle w:val="VerbatimChar"/>
+              </w:rPr>
+              <w:t xml:space="preserve">bill_item_user</w:t>
+            </w:r>
+            <w:r>
+              <w:t xml:space="preserve">,</w:t>
+            </w:r>
+            <w:r>
+              <w:t xml:space="preserve"> </w:t>
+            </w:r>
+            <w:r>
+              <w:rPr>
+                <w:rStyle w:val="VerbatimChar"/>
+              </w:rPr>
+              <w:t xml:space="preserve">bill_splits</w:t>
+            </w:r>
+          </w:p>
+        </w:tc>
+      </w:tr>
+      <w:tr>
+        <w:tc>
+          <w:tcPr/>
+          <w:p>
+            <w:pPr>
+              <w:pStyle w:val="Compact"/>
+              <w:jc w:val="left"/>
+            </w:pPr>
+            <w:r>
+              <w:t xml:space="preserve">Baza danych (MySQL)</w:t>
+            </w:r>
+          </w:p>
+        </w:tc>
+        <w:tc>
+          <w:tcPr/>
+          <w:p>
+            <w:pPr>
+              <w:pStyle w:val="Compact"/>
+              <w:jc w:val="left"/>
+            </w:pPr>
+            <w:r>
+              <w:t xml:space="preserve">—</w:t>
+            </w:r>
+          </w:p>
+        </w:tc>
+        <w:tc>
+          <w:tcPr/>
+          <w:p>
+            <w:pPr>
+              <w:pStyle w:val="Compact"/>
+              <w:jc w:val="left"/>
+            </w:pPr>
+            <w:r>
+              <w:t xml:space="preserve">triggery salda grupy + funkcja</w:t>
+            </w:r>
+            <w:r>
+              <w:t xml:space="preserve"> </w:t>
+            </w:r>
+            <w:r>
+              <w:rPr>
+                <w:rStyle w:val="VerbatimChar"/>
+              </w:rPr>
+              <w:t xml:space="preserve">get_user_net_balance()</w:t>
+            </w:r>
+          </w:p>
+        </w:tc>
+      </w:tr>
+      <w:tr>
+        <w:tc>
+          <w:tcPr/>
+          <w:p>
+            <w:pPr>
+              <w:pStyle w:val="Compact"/>
+              <w:jc w:val="left"/>
+            </w:pPr>
+            <w:r>
+              <w:t xml:space="preserve">Frontend (widoki)</w:t>
+            </w:r>
+          </w:p>
+        </w:tc>
+        <w:tc>
+          <w:tcPr/>
+          <w:p>
+            <w:pPr>
+              <w:pStyle w:val="Compact"/>
+              <w:jc w:val="left"/>
+            </w:pPr>
+            <w:r>
+              <w:t xml:space="preserve">logowanie/rejestracja, lista i formularze grup, katalog, panel admina</w:t>
+            </w:r>
+          </w:p>
+        </w:tc>
+        <w:tc>
+          <w:tcPr/>
+          <w:p>
+            <w:pPr>
+              <w:pStyle w:val="Compact"/>
+              <w:jc w:val="left"/>
+            </w:pPr>
+            <w:r>
+              <w:t xml:space="preserve">strona grupy (rachunki, salda, plan rozliczeń, statystyki), formularze rachunków i pozycji</w:t>
+            </w:r>
+          </w:p>
+        </w:tc>
+      </w:tr>
+      <w:tr>
+        <w:tc>
+          <w:tcPr/>
+          <w:p>
+            <w:pPr>
+              <w:pStyle w:val="Compact"/>
+              <w:jc w:val="left"/>
+            </w:pPr>
+            <w:r>
+              <w:t xml:space="preserve">Wspólne</w:t>
+            </w:r>
+          </w:p>
+        </w:tc>
+        <w:tc>
+          <w:tcPr/>
+          <w:p>
+            <w:pPr>
+              <w:pStyle w:val="Compact"/>
+              <w:jc w:val="left"/>
+            </w:pPr>
+            <w:r>
+              <w:t xml:space="preserve">layout, motyw jasny/ciemny, nawigacja, strona główna, seeder danych testowych</w:t>
+            </w:r>
+          </w:p>
+        </w:tc>
+        <w:tc>
+          <w:tcPr/>
+          <w:p>
+            <w:pPr>
+              <w:pStyle w:val="Compact"/>
+              <w:jc w:val="left"/>
+            </w:pPr>
+            <w:r>
+              <w:t xml:space="preserve">jw.</w:t>
+            </w:r>
+          </w:p>
+        </w:tc>
+      </w:tr>
+    </w:tbl>
+    <w:bookmarkStart w:id="21" w:name="X60dcc2533174c7cff48386411421e1f928bae9d"/>
+    <w:p>
+      <w:pPr>
+        <w:pStyle w:val="Heading4"/>
+      </w:pPr>
+      <w:r>
+        <w:t xml:space="preserve">1.2.1. Zakres Osoby 1 — Konta, grupy i administracja</w:t>
+      </w:r>
+    </w:p>
+    <w:p>
+      <w:pPr>
+        <w:numPr>
+          <w:ilvl w:val="0"/>
+          <w:numId w:val="1002"/>
+        </w:numPr>
+        <w:pStyle w:val="Compact"/>
+      </w:pPr>
+      <w:r>
+        <w:t xml:space="preserve">Uwierzytelnianie i role użytkowników (Laravel Breeze, kolumna</w:t>
+      </w:r>
+      <w:r>
+        <w:t xml:space="preserve"> </w:t>
+      </w:r>
+      <w:r>
+        <w:rPr>
+          <w:rStyle w:val="VerbatimChar"/>
+        </w:rPr>
+        <w:t xml:space="preserve">role</w:t>
+      </w:r>
+      <w:r>
+        <w:t xml:space="preserve">,</w:t>
+      </w:r>
+      <w:r>
+        <w:t xml:space="preserve"> </w:t>
+      </w:r>
+      <w:r>
+        <w:rPr>
+          <w:rStyle w:val="VerbatimChar"/>
+        </w:rPr>
+        <w:t xml:space="preserve">AdminMiddleware</w:t>
+      </w:r>
+      <w:r>
+        <w:t xml:space="preserve">).</w:t>
+      </w:r>
+    </w:p>
+    <w:p>
+      <w:pPr>
+        <w:numPr>
+          <w:ilvl w:val="0"/>
+          <w:numId w:val="1002"/>
+        </w:numPr>
+        <w:pStyle w:val="Compact"/>
+      </w:pPr>
+      <w:r>
+        <w:t xml:space="preserve">CRUD grup rozliczeniowych (tworzenie, lista, edycja, usuwanie) z walidacją po stronie serwera i klienta oraz unikalnością nazwy.</w:t>
+      </w:r>
+    </w:p>
+    <w:p>
+      <w:pPr>
+        <w:numPr>
+          <w:ilvl w:val="0"/>
+          <w:numId w:val="1002"/>
+        </w:numPr>
+        <w:pStyle w:val="Compact"/>
+      </w:pPr>
+      <w:r>
+        <w:t xml:space="preserve">Kontrola dostępu do grup (członek/właściciel/admin).</w:t>
+      </w:r>
+    </w:p>
+    <w:p>
+      <w:pPr>
+        <w:numPr>
+          <w:ilvl w:val="0"/>
+          <w:numId w:val="1002"/>
+        </w:numPr>
+        <w:pStyle w:val="Compact"/>
+      </w:pPr>
+      <w:r>
+        <w:t xml:space="preserve">Publiczny katalog grup z filtrowaniem i sortowaniem.</w:t>
+      </w:r>
+    </w:p>
+    <w:p>
+      <w:pPr>
+        <w:numPr>
+          <w:ilvl w:val="0"/>
+          <w:numId w:val="1002"/>
+        </w:numPr>
+        <w:pStyle w:val="Compact"/>
+      </w:pPr>
+      <w:r>
+        <w:t xml:space="preserve">Panel administratora: zarządzanie kontami i rolami użytkowników.</w:t>
+      </w:r>
+    </w:p>
     <w:bookmarkEnd w:id="21"/>
+    <w:bookmarkStart w:id="22" w:name="zakres-osoby-2-rachunki-i-rozliczenia"/>
+    <w:p>
+      <w:pPr>
+        <w:pStyle w:val="Heading4"/>
+      </w:pPr>
+      <w:r>
+        <w:t xml:space="preserve">1.2.2. Zakres Osoby 2 — Rachunki i rozliczenia</w:t>
+      </w:r>
+    </w:p>
+    <w:p>
+      <w:pPr>
+        <w:numPr>
+          <w:ilvl w:val="0"/>
+          <w:numId w:val="1003"/>
+        </w:numPr>
+        <w:pStyle w:val="Compact"/>
+      </w:pPr>
+      <w:r>
+        <w:t xml:space="preserve">Dodawanie i usuwanie rachunków oraz pozycji z paragonu wraz z walidacją kwot.</w:t>
+      </w:r>
+    </w:p>
+    <w:p>
+      <w:pPr>
+        <w:numPr>
+          <w:ilvl w:val="0"/>
+          <w:numId w:val="1003"/>
+        </w:numPr>
+        <w:pStyle w:val="Compact"/>
+      </w:pPr>
+      <w:r>
+        <w:t xml:space="preserve">Automatyczne dzielenie kosztów (po równo oraz na podstawie pozycji paragonu) —</w:t>
+      </w:r>
+      <w:r>
+        <w:t xml:space="preserve"> </w:t>
+      </w:r>
+      <w:r>
+        <w:rPr>
+          <w:rStyle w:val="VerbatimChar"/>
+        </w:rPr>
+        <w:t xml:space="preserve">BillSplitService</w:t>
+      </w:r>
+      <w:r>
+        <w:t xml:space="preserve">.</w:t>
+      </w:r>
+    </w:p>
+    <w:p>
+      <w:pPr>
+        <w:numPr>
+          <w:ilvl w:val="0"/>
+          <w:numId w:val="1003"/>
+        </w:numPr>
+        <w:pStyle w:val="Compact"/>
+      </w:pPr>
+      <w:r>
+        <w:t xml:space="preserve">Algorytm planu rozliczeń minimalizujący liczbę przelewów (</w:t>
+      </w:r>
+      <w:r>
+        <w:rPr>
+          <w:rStyle w:val="VerbatimChar"/>
+        </w:rPr>
+        <w:t xml:space="preserve">Group::getSettlementPlan()</w:t>
+      </w:r>
+      <w:r>
+        <w:t xml:space="preserve">).</w:t>
+      </w:r>
+    </w:p>
+    <w:p>
+      <w:pPr>
+        <w:numPr>
+          <w:ilvl w:val="0"/>
+          <w:numId w:val="1003"/>
+        </w:numPr>
+        <w:pStyle w:val="Compact"/>
+      </w:pPr>
+      <w:r>
+        <w:t xml:space="preserve">Statystyki wydatków grupy (bieżący miesiąc, ostatnie 30 dni, najwyższy/średni rachunek).</w:t>
+      </w:r>
+    </w:p>
+    <w:p>
+      <w:pPr>
+        <w:numPr>
+          <w:ilvl w:val="0"/>
+          <w:numId w:val="1003"/>
+        </w:numPr>
+        <w:pStyle w:val="Compact"/>
+      </w:pPr>
+      <w:r>
+        <w:t xml:space="preserve">Automatyczne saldo grupy (triggery MySQL / logika PHP na SQLite) oraz funkcja SQL</w:t>
+      </w:r>
+      <w:r>
+        <w:t xml:space="preserve"> </w:t>
+      </w:r>
+      <w:r>
+        <w:rPr>
+          <w:rStyle w:val="VerbatimChar"/>
+        </w:rPr>
+        <w:t xml:space="preserve">get_user_net_balance()</w:t>
+      </w:r>
+      <w:r>
+        <w:t xml:space="preserve">.</w:t>
+      </w:r>
+    </w:p>
     <w:bookmarkEnd w:id="22"/>
-    <w:bookmarkStart w:id="29" w:name="uruchomienie-projektu-developer"/>
+    <w:bookmarkStart w:id="23" w:name="część-wspólna-osoba-1-osoba-2"/>
+    <w:p>
+      <w:pPr>
+        <w:pStyle w:val="Heading4"/>
+      </w:pPr>
+      <w:r>
+        <w:t xml:space="preserve">1.2.3. Część wspólna (Osoba 1 + Osoba 2)</w:t>
+      </w:r>
+    </w:p>
+    <w:p>
+      <w:pPr>
+        <w:numPr>
+          <w:ilvl w:val="0"/>
+          <w:numId w:val="1004"/>
+        </w:numPr>
+        <w:pStyle w:val="Compact"/>
+      </w:pPr>
+      <w:r>
+        <w:t xml:space="preserve">Layout aplikacji, nawigacja, motyw jasny/ciemny, strona główna z licznikami.</w:t>
+      </w:r>
+    </w:p>
+    <w:p>
+      <w:pPr>
+        <w:numPr>
+          <w:ilvl w:val="0"/>
+          <w:numId w:val="1004"/>
+        </w:numPr>
+        <w:pStyle w:val="Compact"/>
+      </w:pPr>
+      <w:r>
+        <w:t xml:space="preserve">Seeder danych testowych (użytkownicy, grupa, rachunek, podział kosztów).</w:t>
+      </w:r>
+    </w:p>
+    <w:p>
+      <w:r>
+        <w:pict>
+          <v:rect style="width:0;height:1.5pt" o:hralign="center" o:hrstd="t" o:hr="t"/>
+        </w:pict>
+      </w:r>
+    </w:p>
+    <w:bookmarkEnd w:id="23"/>
+    <w:bookmarkEnd w:id="24"/>
+    <w:bookmarkEnd w:id="25"/>
+    <w:bookmarkStart w:id="32" w:name="X2187a98bb58d17920477ba39a060f75c0181034"/>
     <w:p>
       <w:pPr>
         <w:pStyle w:val="Heading2"/>
       </w:pPr>
       <w:r>
-        <w:t xml:space="preserve">2. Uruchomienie projektu (developer)</w:t>
-      </w:r>
-    </w:p>
-    <w:bookmarkStart w:id="23" w:name="użyte-technologie"/>
+        <w:t xml:space="preserve">2. Uruchomienie projektu (developer) — (Osoba 1 + Osoba 2)</w:t>
+      </w:r>
+    </w:p>
+    <w:bookmarkStart w:id="26" w:name="użyte-technologie"/>
     <w:p>
       <w:pPr>
         <w:pStyle w:val="Heading3"/>
@@ -1015,8 +1741,8 @@
         </w:tc>
       </w:tr>
     </w:tbl>
-    <w:bookmarkEnd w:id="23"/>
-    <w:bookmarkStart w:id="24" w:name="wymagania-programowe"/>
+    <w:bookmarkEnd w:id="26"/>
+    <w:bookmarkStart w:id="27" w:name="wymagania-programowe"/>
     <w:p>
       <w:pPr>
         <w:pStyle w:val="Heading3"/>
@@ -1029,7 +1755,7 @@
       <w:pPr>
         <w:numPr>
           <w:ilvl w:val="0"/>
-          <w:numId w:val="1002"/>
+          <w:numId w:val="1005"/>
         </w:numPr>
         <w:pStyle w:val="Compact"/>
       </w:pPr>
@@ -1041,7 +1767,7 @@
       <w:pPr>
         <w:numPr>
           <w:ilvl w:val="0"/>
-          <w:numId w:val="1002"/>
+          <w:numId w:val="1005"/>
         </w:numPr>
         <w:pStyle w:val="Compact"/>
       </w:pPr>
@@ -1113,7 +1839,7 @@
       <w:pPr>
         <w:numPr>
           <w:ilvl w:val="0"/>
-          <w:numId w:val="1002"/>
+          <w:numId w:val="1005"/>
         </w:numPr>
         <w:pStyle w:val="Compact"/>
       </w:pPr>
@@ -1125,7 +1851,7 @@
       <w:pPr>
         <w:numPr>
           <w:ilvl w:val="0"/>
-          <w:numId w:val="1002"/>
+          <w:numId w:val="1005"/>
         </w:numPr>
         <w:pStyle w:val="Compact"/>
       </w:pPr>
@@ -1137,7 +1863,7 @@
       <w:pPr>
         <w:numPr>
           <w:ilvl w:val="0"/>
-          <w:numId w:val="1002"/>
+          <w:numId w:val="1005"/>
         </w:numPr>
         <w:pStyle w:val="Compact"/>
       </w:pPr>
@@ -1149,7 +1875,7 @@
       <w:pPr>
         <w:numPr>
           <w:ilvl w:val="0"/>
-          <w:numId w:val="1002"/>
+          <w:numId w:val="1005"/>
         </w:numPr>
         <w:pStyle w:val="Compact"/>
       </w:pPr>
@@ -1157,8 +1883,8 @@
         <w:t xml:space="preserve">Przeglądarka internetowa (Chrome, Firefox, Edge).</w:t>
       </w:r>
     </w:p>
-    <w:bookmarkEnd w:id="24"/>
-    <w:bookmarkStart w:id="25" w:name="proces-instalacji"/>
+    <w:bookmarkEnd w:id="27"/>
+    <w:bookmarkStart w:id="28" w:name="proces-instalacji"/>
     <w:p>
       <w:pPr>
         <w:pStyle w:val="Heading3"/>
@@ -1171,7 +1897,7 @@
       <w:pPr>
         <w:numPr>
           <w:ilvl w:val="0"/>
-          <w:numId w:val="1003"/>
+          <w:numId w:val="1006"/>
         </w:numPr>
         <w:pStyle w:val="Compact"/>
       </w:pPr>
@@ -1192,7 +1918,7 @@
       <w:pPr>
         <w:numPr>
           <w:ilvl w:val="0"/>
-          <w:numId w:val="1003"/>
+          <w:numId w:val="1006"/>
         </w:numPr>
         <w:pStyle w:val="Compact"/>
       </w:pPr>
@@ -1204,7 +1930,7 @@
       <w:pPr>
         <w:numPr>
           <w:ilvl w:val="0"/>
-          <w:numId w:val="1003"/>
+          <w:numId w:val="1006"/>
         </w:numPr>
         <w:pStyle w:val="Compact"/>
       </w:pPr>
@@ -1225,7 +1951,7 @@
       <w:pPr>
         <w:numPr>
           <w:ilvl w:val="0"/>
-          <w:numId w:val="1003"/>
+          <w:numId w:val="1006"/>
         </w:numPr>
         <w:pStyle w:val="Compact"/>
       </w:pPr>
@@ -1246,7 +1972,7 @@
       <w:pPr>
         <w:numPr>
           <w:ilvl w:val="0"/>
-          <w:numId w:val="1003"/>
+          <w:numId w:val="1006"/>
         </w:numPr>
         <w:pStyle w:val="Compact"/>
       </w:pPr>
@@ -1288,7 +2014,7 @@
       <w:pPr>
         <w:numPr>
           <w:ilvl w:val="0"/>
-          <w:numId w:val="1003"/>
+          <w:numId w:val="1006"/>
         </w:numPr>
         <w:pStyle w:val="Compact"/>
       </w:pPr>
@@ -1305,8 +2031,8 @@
         <w:t xml:space="preserve">php artisan key:generate</w:t>
       </w:r>
     </w:p>
-    <w:bookmarkEnd w:id="25"/>
-    <w:bookmarkStart w:id="26" w:name="proces-konfiguracji"/>
+    <w:bookmarkEnd w:id="28"/>
+    <w:bookmarkStart w:id="29" w:name="proces-konfiguracji"/>
     <w:p>
       <w:pPr>
         <w:pStyle w:val="Heading3"/>
@@ -1560,7 +2286,7 @@
       <w:pPr>
         <w:numPr>
           <w:ilvl w:val="0"/>
-          <w:numId w:val="1004"/>
+          <w:numId w:val="1007"/>
         </w:numPr>
         <w:pStyle w:val="Compact"/>
       </w:pPr>
@@ -1602,7 +2328,7 @@
       <w:pPr>
         <w:numPr>
           <w:ilvl w:val="0"/>
-          <w:numId w:val="1004"/>
+          <w:numId w:val="1007"/>
         </w:numPr>
         <w:pStyle w:val="Compact"/>
       </w:pPr>
@@ -1623,7 +2349,7 @@
       <w:pPr>
         <w:numPr>
           <w:ilvl w:val="0"/>
-          <w:numId w:val="1004"/>
+          <w:numId w:val="1007"/>
         </w:numPr>
         <w:pStyle w:val="Compact"/>
       </w:pPr>
@@ -1698,8 +2424,8 @@
         <w:t xml:space="preserve">; na SQLite ich rolę przejmuje logika w PHP (salda i sumy liczone są po stronie aplikacji), więc aplikacja działa w pełni również na SQLite.</w:t>
       </w:r>
     </w:p>
-    <w:bookmarkEnd w:id="26"/>
-    <w:bookmarkStart w:id="27" w:name="dane-początkowe-seed-konta-testowe"/>
+    <w:bookmarkEnd w:id="29"/>
+    <w:bookmarkStart w:id="30" w:name="dane-początkowe-seed-konta-testowe"/>
     <w:p>
       <w:pPr>
         <w:pStyle w:val="Heading3"/>
@@ -1961,8 +2687,8 @@
         <w:t xml:space="preserve">celowo nie należy do grupy — służy do testowania kontroli dostępu.</w:t>
       </w:r>
     </w:p>
-    <w:bookmarkEnd w:id="27"/>
-    <w:bookmarkStart w:id="28" w:name="uruchomienie-w-terminalu"/>
+    <w:bookmarkEnd w:id="30"/>
+    <w:bookmarkStart w:id="31" w:name="uruchomienie-w-terminalu"/>
     <w:p>
       <w:pPr>
         <w:pStyle w:val="Heading3"/>
@@ -2047,15 +2773,15 @@
         </w:pict>
       </w:r>
     </w:p>
-    <w:bookmarkEnd w:id="28"/>
-    <w:bookmarkEnd w:id="29"/>
-    <w:bookmarkStart w:id="30" w:name="uruchomienie-projektu-użytkownik-końcowy"/>
+    <w:bookmarkEnd w:id="31"/>
+    <w:bookmarkEnd w:id="32"/>
+    <w:bookmarkStart w:id="33" w:name="Xba61ab3d68ca011a8bcb5f1065b10db98d4b13f"/>
     <w:p>
       <w:pPr>
         <w:pStyle w:val="Heading2"/>
       </w:pPr>
       <w:r>
-        <w:t xml:space="preserve">3. Uruchomienie projektu (użytkownik końcowy)</w:t>
+        <w:t xml:space="preserve">3. Uruchomienie projektu (użytkownik końcowy) — (Osoba 1 + Osoba 2)</w:t>
       </w:r>
     </w:p>
     <w:p>
@@ -2099,8 +2825,8 @@
         </w:pict>
       </w:r>
     </w:p>
-    <w:bookmarkEnd w:id="30"/>
-    <w:bookmarkStart w:id="41" w:name="podręcznik-użytkownika"/>
+    <w:bookmarkEnd w:id="33"/>
+    <w:bookmarkStart w:id="44" w:name="podręcznik-użytkownika"/>
     <w:p>
       <w:pPr>
         <w:pStyle w:val="Heading2"/>
@@ -2109,13 +2835,13 @@
         <w:t xml:space="preserve">4. Podręcznik użytkownika</w:t>
       </w:r>
     </w:p>
-    <w:bookmarkStart w:id="31" w:name="strona-główna-i-logowanie"/>
+    <w:bookmarkStart w:id="34" w:name="strona-główna-i-logowanie-osoba-1"/>
     <w:p>
       <w:pPr>
         <w:pStyle w:val="Heading3"/>
       </w:pPr>
       <w:r>
-        <w:t xml:space="preserve">4.1. Strona główna i logowanie</w:t>
+        <w:t xml:space="preserve">4.1. Strona główna i logowanie — (Osoba 1)</w:t>
       </w:r>
     </w:p>
     <w:p>
@@ -2152,14 +2878,14 @@
         <w:t xml:space="preserve">[Miejsce na Rys. 1] — Strona główna z opisem aplikacji i licznikami.</w:t>
       </w:r>
     </w:p>
-    <w:bookmarkEnd w:id="31"/>
-    <w:bookmarkStart w:id="32" w:name="moje-grupy-lista-read"/>
+    <w:bookmarkEnd w:id="34"/>
+    <w:bookmarkStart w:id="35" w:name="moje-grupy-lista-read-osoba-1"/>
     <w:p>
       <w:pPr>
         <w:pStyle w:val="Heading3"/>
       </w:pPr>
       <w:r>
-        <w:t xml:space="preserve">4.2. Moje grupy — lista (READ)</w:t>
+        <w:t xml:space="preserve">4.2. Moje grupy — lista (READ) — (Osoba 1)</w:t>
       </w:r>
     </w:p>
     <w:p>
@@ -2199,7 +2925,7 @@
       <w:pPr>
         <w:numPr>
           <w:ilvl w:val="0"/>
-          <w:numId w:val="1005"/>
+          <w:numId w:val="1008"/>
         </w:numPr>
         <w:pStyle w:val="Compact"/>
       </w:pPr>
@@ -2211,7 +2937,7 @@
       <w:pPr>
         <w:numPr>
           <w:ilvl w:val="0"/>
-          <w:numId w:val="1005"/>
+          <w:numId w:val="1008"/>
         </w:numPr>
         <w:pStyle w:val="Compact"/>
       </w:pPr>
@@ -2223,7 +2949,7 @@
       <w:pPr>
         <w:numPr>
           <w:ilvl w:val="0"/>
-          <w:numId w:val="1005"/>
+          <w:numId w:val="1008"/>
         </w:numPr>
         <w:pStyle w:val="Compact"/>
       </w:pPr>
@@ -2235,7 +2961,7 @@
       <w:pPr>
         <w:numPr>
           <w:ilvl w:val="0"/>
-          <w:numId w:val="1005"/>
+          <w:numId w:val="1008"/>
         </w:numPr>
         <w:pStyle w:val="Compact"/>
       </w:pPr>
@@ -2251,14 +2977,14 @@
         <w:t xml:space="preserve">[Miejsce na Rys. 2] — Lista grup z wyszukiwarką.</w:t>
       </w:r>
     </w:p>
-    <w:bookmarkEnd w:id="32"/>
-    <w:bookmarkStart w:id="33" w:name="X8c937c3eab3cdd01a27073660dd38340beccd29"/>
+    <w:bookmarkEnd w:id="35"/>
+    <w:bookmarkStart w:id="36" w:name="X4be99c2481799472491a5019270aa1f9f0403bb"/>
     <w:p>
       <w:pPr>
         <w:pStyle w:val="Heading3"/>
       </w:pPr>
       <w:r>
-        <w:t xml:space="preserve">4.3. Tworzenie grupy (CREATE — użytkownik zalogowany)</w:t>
+        <w:t xml:space="preserve">4.3. Tworzenie grupy (CREATE — użytkownik zalogowany) — (Osoba 1)</w:t>
       </w:r>
     </w:p>
     <w:p>
@@ -2282,7 +3008,7 @@
       <w:pPr>
         <w:numPr>
           <w:ilvl w:val="0"/>
-          <w:numId w:val="1006"/>
+          <w:numId w:val="1009"/>
         </w:numPr>
         <w:pStyle w:val="Compact"/>
       </w:pPr>
@@ -2310,7 +3036,7 @@
       <w:pPr>
         <w:numPr>
           <w:ilvl w:val="0"/>
-          <w:numId w:val="1006"/>
+          <w:numId w:val="1009"/>
         </w:numPr>
         <w:pStyle w:val="Compact"/>
       </w:pPr>
@@ -2438,14 +3164,14 @@
         <w:t xml:space="preserve">[Miejsce na Rys. 3] — Formularz tworzenia grupy.</w:t>
       </w:r>
     </w:p>
-    <w:bookmarkEnd w:id="33"/>
-    <w:bookmarkStart w:id="34" w:name="X7cc4353dba8b156802061e0af2b1ad1de46f3e3"/>
+    <w:bookmarkEnd w:id="36"/>
+    <w:bookmarkStart w:id="37" w:name="Xc799a7b3d97f6bcdeee3fce48ec28f3b0cc835f"/>
     <w:p>
       <w:pPr>
         <w:pStyle w:val="Heading3"/>
       </w:pPr>
       <w:r>
-        <w:t xml:space="preserve">4.4. Szczegóły grupy — rachunki, salda i rozliczenia (READ)</w:t>
+        <w:t xml:space="preserve">4.4. Szczegóły grupy — rachunki, salda i rozliczenia (READ) — (Osoba 2)</w:t>
       </w:r>
     </w:p>
     <w:p>
@@ -2573,14 +3299,14 @@
         <w:t xml:space="preserve">[Miejsce na Rys. 4] — Strona grupy: rachunki, salda i plan rozliczeń.</w:t>
       </w:r>
     </w:p>
-    <w:bookmarkEnd w:id="34"/>
-    <w:bookmarkStart w:id="35" w:name="dodawanie-rachunku-i-pozycji-z-paragonu"/>
+    <w:bookmarkEnd w:id="37"/>
+    <w:bookmarkStart w:id="38" w:name="X496e12316d37fcd3e80f1ba4c7692a54d32459e"/>
     <w:p>
       <w:pPr>
         <w:pStyle w:val="Heading3"/>
       </w:pPr>
       <w:r>
-        <w:t xml:space="preserve">4.5. Dodawanie rachunku i pozycji z paragonu</w:t>
+        <w:t xml:space="preserve">4.5. Dodawanie rachunku i pozycji z paragonu — (Osoba 2)</w:t>
       </w:r>
     </w:p>
     <w:p>
@@ -2715,21 +3441,21 @@
         <w:t xml:space="preserve">[Miejsce na Rys. 5] — Formularz dodawania rachunku / pozycji z paragonu.</w:t>
       </w:r>
     </w:p>
-    <w:bookmarkEnd w:id="35"/>
-    <w:bookmarkStart w:id="36" w:name="edycja-i-usuwanie-grupy-update-delete"/>
+    <w:bookmarkEnd w:id="38"/>
+    <w:bookmarkStart w:id="39" w:name="X026f2810e5d56d2de5dbe889ab4e0c26d27e216"/>
     <w:p>
       <w:pPr>
         <w:pStyle w:val="Heading3"/>
       </w:pPr>
       <w:r>
-        <w:t xml:space="preserve">4.6. Edycja i usuwanie grupy (UPDATE / DELETE)</w:t>
+        <w:t xml:space="preserve">4.6. Edycja i usuwanie grupy (UPDATE / DELETE) — (Osoba 1)</w:t>
       </w:r>
     </w:p>
     <w:p>
       <w:pPr>
         <w:numPr>
           <w:ilvl w:val="0"/>
-          <w:numId w:val="1007"/>
+          <w:numId w:val="1010"/>
         </w:numPr>
         <w:pStyle w:val="Compact"/>
       </w:pPr>
@@ -2750,7 +3476,7 @@
       <w:pPr>
         <w:numPr>
           <w:ilvl w:val="0"/>
-          <w:numId w:val="1007"/>
+          <w:numId w:val="1010"/>
         </w:numPr>
         <w:pStyle w:val="Compact"/>
       </w:pPr>
@@ -2771,7 +3497,7 @@
       <w:pPr>
         <w:numPr>
           <w:ilvl w:val="0"/>
-          <w:numId w:val="1007"/>
+          <w:numId w:val="1010"/>
         </w:numPr>
         <w:pStyle w:val="Compact"/>
       </w:pPr>
@@ -2788,14 +3514,14 @@
         <w:t xml:space="preserve">) — dostępne dla członków grupy.</w:t>
       </w:r>
     </w:p>
-    <w:bookmarkEnd w:id="36"/>
-    <w:bookmarkStart w:id="37" w:name="publiczny-katalog-grup"/>
+    <w:bookmarkEnd w:id="39"/>
+    <w:bookmarkStart w:id="40" w:name="publiczny-katalog-grup-osoba-1"/>
     <w:p>
       <w:pPr>
         <w:pStyle w:val="Heading3"/>
       </w:pPr>
       <w:r>
-        <w:t xml:space="preserve">4.7. Publiczny katalog grup</w:t>
+        <w:t xml:space="preserve">4.7. Publiczny katalog grup — (Osoba 1)</w:t>
       </w:r>
     </w:p>
     <w:p>
@@ -2882,14 +3608,14 @@
         <w:t xml:space="preserve">[Miejsce na Rys. 6] — Publiczny katalog grup z filtrami i sortowaniem.</w:t>
       </w:r>
     </w:p>
-    <w:bookmarkEnd w:id="37"/>
-    <w:bookmarkStart w:id="38" w:name="role-w-systemie"/>
+    <w:bookmarkEnd w:id="40"/>
+    <w:bookmarkStart w:id="41" w:name="role-w-systemie-osoba-1"/>
     <w:p>
       <w:pPr>
         <w:pStyle w:val="Heading3"/>
       </w:pPr>
       <w:r>
-        <w:t xml:space="preserve">4.8. Role w systemie</w:t>
+        <w:t xml:space="preserve">4.8. Role w systemie — (Osoba 1)</w:t>
       </w:r>
     </w:p>
     <w:tbl>
@@ -2985,21 +3711,21 @@
         </w:tc>
       </w:tr>
     </w:tbl>
-    <w:bookmarkEnd w:id="38"/>
-    <w:bookmarkStart w:id="39" w:name="przypadki-brzegowe-walidacja"/>
+    <w:bookmarkEnd w:id="41"/>
+    <w:bookmarkStart w:id="42" w:name="X6dbff2a79b3c019d8de4d0804029d6428f8f514"/>
     <w:p>
       <w:pPr>
         <w:pStyle w:val="Heading3"/>
       </w:pPr>
       <w:r>
-        <w:t xml:space="preserve">4.9. Przypadki brzegowe (walidacja)</w:t>
+        <w:t xml:space="preserve">4.9. Przypadki brzegowe (walidacja) — (Osoba 1 + Osoba 2)</w:t>
       </w:r>
     </w:p>
     <w:p>
       <w:pPr>
         <w:numPr>
           <w:ilvl w:val="0"/>
-          <w:numId w:val="1008"/>
+          <w:numId w:val="1011"/>
         </w:numPr>
         <w:pStyle w:val="Compact"/>
       </w:pPr>
@@ -3023,7 +3749,7 @@
       <w:pPr>
         <w:numPr>
           <w:ilvl w:val="0"/>
-          <w:numId w:val="1008"/>
+          <w:numId w:val="1011"/>
         </w:numPr>
         <w:pStyle w:val="Compact"/>
       </w:pPr>
@@ -3035,7 +3761,7 @@
       <w:pPr>
         <w:numPr>
           <w:ilvl w:val="0"/>
-          <w:numId w:val="1008"/>
+          <w:numId w:val="1011"/>
         </w:numPr>
         <w:pStyle w:val="Compact"/>
       </w:pPr>
@@ -3047,7 +3773,7 @@
       <w:pPr>
         <w:numPr>
           <w:ilvl w:val="0"/>
-          <w:numId w:val="1008"/>
+          <w:numId w:val="1011"/>
         </w:numPr>
         <w:pStyle w:val="Compact"/>
       </w:pPr>
@@ -3086,7 +3812,7 @@
       <w:pPr>
         <w:numPr>
           <w:ilvl w:val="0"/>
-          <w:numId w:val="1008"/>
+          <w:numId w:val="1011"/>
         </w:numPr>
         <w:pStyle w:val="Compact"/>
       </w:pPr>
@@ -3110,7 +3836,7 @@
       <w:pPr>
         <w:numPr>
           <w:ilvl w:val="0"/>
-          <w:numId w:val="1008"/>
+          <w:numId w:val="1011"/>
         </w:numPr>
         <w:pStyle w:val="Compact"/>
       </w:pPr>
@@ -3131,7 +3857,7 @@
       <w:pPr>
         <w:numPr>
           <w:ilvl w:val="0"/>
-          <w:numId w:val="1008"/>
+          <w:numId w:val="1011"/>
         </w:numPr>
         <w:pStyle w:val="Compact"/>
       </w:pPr>
@@ -3152,7 +3878,7 @@
       <w:pPr>
         <w:numPr>
           <w:ilvl w:val="0"/>
-          <w:numId w:val="1008"/>
+          <w:numId w:val="1011"/>
         </w:numPr>
         <w:pStyle w:val="Compact"/>
       </w:pPr>
@@ -3160,14 +3886,14 @@
         <w:t xml:space="preserve">Administrator nie może odebrać sobie roli admina ani usunąć własnego konta.</w:t>
       </w:r>
     </w:p>
-    <w:bookmarkEnd w:id="39"/>
-    <w:bookmarkStart w:id="40" w:name="responsywność"/>
+    <w:bookmarkEnd w:id="42"/>
+    <w:bookmarkStart w:id="43" w:name="responsywność-osoba-1-osoba-2"/>
     <w:p>
       <w:pPr>
         <w:pStyle w:val="Heading3"/>
       </w:pPr>
       <w:r>
-        <w:t xml:space="preserve">4.10. Responsywność</w:t>
+        <w:t xml:space="preserve">4.10. Responsywność — (Osoba 1 + Osoba 2)</w:t>
       </w:r>
     </w:p>
     <w:p>
@@ -3229,15 +3955,15 @@
         </w:pict>
       </w:r>
     </w:p>
-    <w:bookmarkEnd w:id="40"/>
-    <w:bookmarkEnd w:id="41"/>
-    <w:bookmarkStart w:id="45" w:name="udokumentowany-crud-zasób-grupa-group"/>
+    <w:bookmarkEnd w:id="43"/>
+    <w:bookmarkEnd w:id="44"/>
+    <w:bookmarkStart w:id="48" w:name="Xac6d57a5316d77ec8044638fcbfdd9f42fc5ddf"/>
     <w:p>
       <w:pPr>
         <w:pStyle w:val="Heading2"/>
       </w:pPr>
       <w:r>
-        <w:t xml:space="preserve">5. Udokumentowany CRUD — zasób Grupa (Group)</w:t>
+        <w:t xml:space="preserve">5. Udokumentowany CRUD — zasób Grupa (Group) — (Osoba 1)</w:t>
       </w:r>
     </w:p>
     <w:p>
@@ -3723,7 +4449,7 @@
         </w:tc>
       </w:tr>
     </w:tbl>
-    <w:bookmarkStart w:id="42" w:name="create-szczegóły-formularza"/>
+    <w:bookmarkStart w:id="45" w:name="create-szczegóły-formularza"/>
     <w:p>
       <w:pPr>
         <w:pStyle w:val="Heading3"/>
@@ -3794,8 +4520,8 @@
         <w:t xml:space="preserve">, więc od razu staje się członkiem grupy.</w:t>
       </w:r>
     </w:p>
-    <w:bookmarkEnd w:id="42"/>
-    <w:bookmarkStart w:id="43" w:name="read-filtrowanie-i-sortowanie"/>
+    <w:bookmarkEnd w:id="45"/>
+    <w:bookmarkStart w:id="46" w:name="read-filtrowanie-i-sortowanie"/>
     <w:p>
       <w:pPr>
         <w:pStyle w:val="Heading3"/>
@@ -3808,7 +4534,7 @@
       <w:pPr>
         <w:numPr>
           <w:ilvl w:val="0"/>
-          <w:numId w:val="1009"/>
+          <w:numId w:val="1012"/>
         </w:numPr>
         <w:pStyle w:val="Compact"/>
       </w:pPr>
@@ -3848,7 +4574,7 @@
       <w:pPr>
         <w:numPr>
           <w:ilvl w:val="0"/>
-          <w:numId w:val="1009"/>
+          <w:numId w:val="1012"/>
         </w:numPr>
         <w:pStyle w:val="Compact"/>
       </w:pPr>
@@ -3887,8 +4613,8 @@
         <w:t xml:space="preserve">.</w:t>
       </w:r>
     </w:p>
-    <w:bookmarkEnd w:id="43"/>
-    <w:bookmarkStart w:id="44" w:name="update-delete-walidacja-i-autoryzacja"/>
+    <w:bookmarkEnd w:id="46"/>
+    <w:bookmarkStart w:id="47" w:name="update-delete-walidacja-i-autoryzacja"/>
     <w:p>
       <w:pPr>
         <w:pStyle w:val="Heading3"/>
@@ -3960,18 +4686,18 @@
         </w:pict>
       </w:r>
     </w:p>
-    <w:bookmarkEnd w:id="44"/>
-    <w:bookmarkEnd w:id="45"/>
-    <w:bookmarkStart w:id="50" w:name="role-uprawnienia-i-zarządzanie"/>
+    <w:bookmarkEnd w:id="47"/>
+    <w:bookmarkEnd w:id="48"/>
+    <w:bookmarkStart w:id="53" w:name="role-uprawnienia-i-zarządzanie-osoba-1"/>
     <w:p>
       <w:pPr>
         <w:pStyle w:val="Heading2"/>
       </w:pPr>
       <w:r>
-        <w:t xml:space="preserve">6. Role, uprawnienia i zarządzanie</w:t>
-      </w:r>
-    </w:p>
-    <w:bookmarkStart w:id="46" w:name="role-użytkowników"/>
+        <w:t xml:space="preserve">6. Role, uprawnienia i zarządzanie — (Osoba 1)</w:t>
+      </w:r>
+    </w:p>
+    <w:bookmarkStart w:id="49" w:name="role-użytkowników"/>
     <w:p>
       <w:pPr>
         <w:pStyle w:val="Heading3"/>
@@ -4069,8 +4795,8 @@
         <w:t xml:space="preserve">.</w:t>
       </w:r>
     </w:p>
-    <w:bookmarkEnd w:id="46"/>
-    <w:bookmarkStart w:id="47" w:name="uprawnienia"/>
+    <w:bookmarkEnd w:id="49"/>
+    <w:bookmarkStart w:id="50" w:name="uprawnienia"/>
     <w:p>
       <w:pPr>
         <w:pStyle w:val="Heading3"/>
@@ -4083,7 +4809,7 @@
       <w:pPr>
         <w:numPr>
           <w:ilvl w:val="0"/>
-          <w:numId w:val="1010"/>
+          <w:numId w:val="1013"/>
         </w:numPr>
         <w:pStyle w:val="Compact"/>
       </w:pPr>
@@ -4125,7 +4851,7 @@
       <w:pPr>
         <w:numPr>
           <w:ilvl w:val="0"/>
-          <w:numId w:val="1010"/>
+          <w:numId w:val="1013"/>
         </w:numPr>
         <w:pStyle w:val="Compact"/>
       </w:pPr>
@@ -4173,7 +4899,7 @@
       <w:pPr>
         <w:numPr>
           <w:ilvl w:val="0"/>
-          <w:numId w:val="1010"/>
+          <w:numId w:val="1013"/>
         </w:numPr>
         <w:pStyle w:val="Compact"/>
       </w:pPr>
@@ -4194,7 +4920,7 @@
       <w:pPr>
         <w:numPr>
           <w:ilvl w:val="0"/>
-          <w:numId w:val="1010"/>
+          <w:numId w:val="1013"/>
         </w:numPr>
         <w:pStyle w:val="Compact"/>
       </w:pPr>
@@ -4211,8 +4937,8 @@
         <w:t xml:space="preserve">— edycja/usuwanie grupy tylko dla właściciela lub admina.</w:t>
       </w:r>
     </w:p>
-    <w:bookmarkEnd w:id="47"/>
-    <w:bookmarkStart w:id="48" w:name="zarządzanie-zasobami-przez-użytkownika"/>
+    <w:bookmarkEnd w:id="50"/>
+    <w:bookmarkStart w:id="51" w:name="zarządzanie-zasobami-przez-użytkownika"/>
     <w:p>
       <w:pPr>
         <w:pStyle w:val="Heading3"/>
@@ -4229,8 +4955,8 @@
         <w:t xml:space="preserve">Użytkownik zarządza swoimi grupami (tworzy, edytuje, usuwa), dodaje uczestników po e-mailu, zapisuje rachunki i pozycje z paragonu oraz przegląda salda, plan rozliczeń i statystyki.</w:t>
       </w:r>
     </w:p>
-    <w:bookmarkEnd w:id="48"/>
-    <w:bookmarkStart w:id="49" w:name="X3be76ff2c4d63b65774b730578789215c21aacf"/>
+    <w:bookmarkEnd w:id="51"/>
+    <w:bookmarkStart w:id="52" w:name="X3be76ff2c4d63b65774b730578789215c21aacf"/>
     <w:p>
       <w:pPr>
         <w:pStyle w:val="Heading3"/>
@@ -4301,18 +5027,18 @@
         </w:pict>
       </w:r>
     </w:p>
-    <w:bookmarkEnd w:id="49"/>
-    <w:bookmarkEnd w:id="50"/>
-    <w:bookmarkStart w:id="56" w:name="X2cf305ea19b649d9a1bd34058c247299cba3bf9"/>
+    <w:bookmarkEnd w:id="52"/>
+    <w:bookmarkEnd w:id="53"/>
+    <w:bookmarkStart w:id="59" w:name="X1c1537c583dd6c402086611bc62432457338672"/>
     <w:p>
       <w:pPr>
         <w:pStyle w:val="Heading2"/>
       </w:pPr>
       <w:r>
-        <w:t xml:space="preserve">7. Logika biznesowa wykraczająca poza prosty CRUD</w:t>
-      </w:r>
-    </w:p>
-    <w:bookmarkStart w:id="51" w:name="X87f9dcd647944adab9c9c0890ccec04888c1d69"/>
+        <w:t xml:space="preserve">7. Logika biznesowa wykraczająca poza prosty CRUD — (Osoba 2)</w:t>
+      </w:r>
+    </w:p>
+    <w:bookmarkStart w:id="54" w:name="X87f9dcd647944adab9c9c0890ccec04888c1d69"/>
     <w:p>
       <w:pPr>
         <w:pStyle w:val="Heading3"/>
@@ -4344,8 +5070,8 @@
         <w:t xml:space="preserve">wylicza salda wszystkich członków (zapłacone − należne), dzieli ich na wierzycieli i dłużników, a następnie iteracyjnie dopasowuje największego dłużnika do największego wierzyciela, tworząc minimalny zestaw przelewów zamykających długi. Obliczenia prowadzone są w groszach (liczby całkowite), aby uniknąć błędów zaokrągleń.</w:t>
       </w:r>
     </w:p>
-    <w:bookmarkEnd w:id="51"/>
-    <w:bookmarkStart w:id="52" w:name="X25f96454fc53a80809902082f08e00bd77a87da"/>
+    <w:bookmarkEnd w:id="54"/>
+    <w:bookmarkStart w:id="55" w:name="X25f96454fc53a80809902082f08e00bd77a87da"/>
     <w:p>
       <w:pPr>
         <w:pStyle w:val="Heading3"/>
@@ -4367,7 +5093,7 @@
       <w:pPr>
         <w:numPr>
           <w:ilvl w:val="0"/>
-          <w:numId w:val="1011"/>
+          <w:numId w:val="1014"/>
         </w:numPr>
         <w:pStyle w:val="Compact"/>
       </w:pPr>
@@ -4404,7 +5130,7 @@
       <w:pPr>
         <w:numPr>
           <w:ilvl w:val="0"/>
-          <w:numId w:val="1011"/>
+          <w:numId w:val="1014"/>
         </w:numPr>
         <w:pStyle w:val="Compact"/>
       </w:pPr>
@@ -4437,8 +5163,8 @@
         <w:t xml:space="preserve">podział na podstawie sumy pozycji; jeśli pozycje nie pokrywają całej kwoty rachunku, brakująca część jest dodatkowo dzielona po równo, a nadwyżka — proporcjonalnie skalowana do kwoty rachunku.</w:t>
       </w:r>
     </w:p>
-    <w:bookmarkEnd w:id="52"/>
-    <w:bookmarkStart w:id="53" w:name="statystyki-wydatków-grupy"/>
+    <w:bookmarkEnd w:id="55"/>
+    <w:bookmarkStart w:id="56" w:name="statystyki-wydatków-grupy"/>
     <w:p>
       <w:pPr>
         <w:pStyle w:val="Heading3"/>
@@ -4464,8 +5190,8 @@
         <w:t xml:space="preserve">agreguje dane: suma wydatków w bieżącym miesiącu, suma z ostatnich 30 dni, najwyższy i średni rachunek, liczba rachunków oraz liczba aktywnych członków.</w:t>
       </w:r>
     </w:p>
-    <w:bookmarkEnd w:id="53"/>
-    <w:bookmarkStart w:id="54" w:name="automatyczne-saldo-grupy"/>
+    <w:bookmarkEnd w:id="56"/>
+    <w:bookmarkStart w:id="57" w:name="automatyczne-saldo-grupy"/>
     <w:p>
       <w:pPr>
         <w:pStyle w:val="Heading3"/>
@@ -4537,8 +5263,8 @@
         <w:t xml:space="preserve">) w kontrolerze rachunków — dzięki czemu aplikacja działa spójnie na obu silnikach.</w:t>
       </w:r>
     </w:p>
-    <w:bookmarkEnd w:id="54"/>
-    <w:bookmarkStart w:id="55" w:name="walidacja-przynależności-do-grupy"/>
+    <w:bookmarkEnd w:id="57"/>
+    <w:bookmarkStart w:id="58" w:name="walidacja-przynależności-do-grupy"/>
     <w:p>
       <w:pPr>
         <w:pStyle w:val="Heading3"/>
@@ -4592,15 +5318,23 @@
         </w:pict>
       </w:r>
     </w:p>
-    <w:bookmarkEnd w:id="55"/>
-    <w:bookmarkEnd w:id="56"/>
-    <w:bookmarkStart w:id="57" w:name="przechowywane-dane-moduły-autora"/>
+    <w:bookmarkEnd w:id="58"/>
+    <w:bookmarkEnd w:id="59"/>
+    <w:bookmarkStart w:id="60" w:name="przechowywane-dane-osoba-1-osoba-2"/>
     <w:p>
       <w:pPr>
         <w:pStyle w:val="Heading2"/>
       </w:pPr>
       <w:r>
-        <w:t xml:space="preserve">8. Przechowywane dane (moduły autora)</w:t>
+        <w:t xml:space="preserve">8. Przechowywane dane — (Osoba 1 + Osoba 2)</w:t>
+      </w:r>
+    </w:p>
+    <w:p>
+      <w:pPr>
+        <w:pStyle w:val="FirstParagraph"/>
+      </w:pPr>
+      <w:r>
+        <w:t xml:space="preserve">W kolumnie „Autor” oznaczono osobę odpowiedzialną za daną tabelę.</w:t>
       </w:r>
     </w:p>
     <w:tbl>
@@ -4611,9 +5345,10 @@
         <w:jc w:val="start"/>
       </w:tblPr>
       <w:tblGrid>
-        <w:gridCol w:w="2184"/>
-        <w:gridCol w:w="4096"/>
-        <w:gridCol w:w="1638"/>
+        <w:gridCol w:w="1760"/>
+        <w:gridCol w:w="3300"/>
+        <w:gridCol w:w="1320"/>
+        <w:gridCol w:w="1540"/>
       </w:tblGrid>
       <w:tr>
         <w:trPr>
@@ -4655,6 +5390,18 @@
             </w:r>
           </w:p>
         </w:tc>
+        <w:tc>
+          <w:tcPr/>
+          <w:p>
+            <w:pPr>
+              <w:pStyle w:val="Compact"/>
+              <w:jc w:val="left"/>
+            </w:pPr>
+            <w:r>
+              <w:t xml:space="preserve">Autor</w:t>
+            </w:r>
+          </w:p>
+        </w:tc>
       </w:tr>
       <w:tr>
         <w:tc>
@@ -4696,6 +5443,18 @@
             </w:r>
           </w:p>
         </w:tc>
+        <w:tc>
+          <w:tcPr/>
+          <w:p>
+            <w:pPr>
+              <w:pStyle w:val="Compact"/>
+              <w:jc w:val="left"/>
+            </w:pPr>
+            <w:r>
+              <w:t xml:space="preserve">Osoba 1</w:t>
+            </w:r>
+          </w:p>
+        </w:tc>
       </w:tr>
       <w:tr>
         <w:tc>
@@ -4737,6 +5496,18 @@
             </w:r>
           </w:p>
         </w:tc>
+        <w:tc>
+          <w:tcPr/>
+          <w:p>
+            <w:pPr>
+              <w:pStyle w:val="Compact"/>
+              <w:jc w:val="left"/>
+            </w:pPr>
+            <w:r>
+              <w:t xml:space="preserve">Osoba 1</w:t>
+            </w:r>
+          </w:p>
+        </w:tc>
       </w:tr>
       <w:tr>
         <w:tc>
@@ -4778,6 +5549,18 @@
             </w:r>
           </w:p>
         </w:tc>
+        <w:tc>
+          <w:tcPr/>
+          <w:p>
+            <w:pPr>
+              <w:pStyle w:val="Compact"/>
+              <w:jc w:val="left"/>
+            </w:pPr>
+            <w:r>
+              <w:t xml:space="preserve">Osoba 1</w:t>
+            </w:r>
+          </w:p>
+        </w:tc>
       </w:tr>
       <w:tr>
         <w:tc>
@@ -4819,6 +5602,18 @@
             </w:r>
           </w:p>
         </w:tc>
+        <w:tc>
+          <w:tcPr/>
+          <w:p>
+            <w:pPr>
+              <w:pStyle w:val="Compact"/>
+              <w:jc w:val="left"/>
+            </w:pPr>
+            <w:r>
+              <w:t xml:space="preserve">Osoba 2</w:t>
+            </w:r>
+          </w:p>
+        </w:tc>
       </w:tr>
       <w:tr>
         <w:tc>
@@ -4860,6 +5655,18 @@
             </w:r>
           </w:p>
         </w:tc>
+        <w:tc>
+          <w:tcPr/>
+          <w:p>
+            <w:pPr>
+              <w:pStyle w:val="Compact"/>
+              <w:jc w:val="left"/>
+            </w:pPr>
+            <w:r>
+              <w:t xml:space="preserve">Osoba 2</w:t>
+            </w:r>
+          </w:p>
+        </w:tc>
       </w:tr>
       <w:tr>
         <w:tc>
@@ -4901,6 +5708,18 @@
             </w:r>
           </w:p>
         </w:tc>
+        <w:tc>
+          <w:tcPr/>
+          <w:p>
+            <w:pPr>
+              <w:pStyle w:val="Compact"/>
+              <w:jc w:val="left"/>
+            </w:pPr>
+            <w:r>
+              <w:t xml:space="preserve">Osoba 2</w:t>
+            </w:r>
+          </w:p>
+        </w:tc>
       </w:tr>
       <w:tr>
         <w:tc>
@@ -4942,6 +5761,18 @@
             </w:r>
           </w:p>
         </w:tc>
+        <w:tc>
+          <w:tcPr/>
+          <w:p>
+            <w:pPr>
+              <w:pStyle w:val="Compact"/>
+              <w:jc w:val="left"/>
+            </w:pPr>
+            <w:r>
+              <w:t xml:space="preserve">Osoba 2</w:t>
+            </w:r>
+          </w:p>
+        </w:tc>
       </w:tr>
     </w:tbl>
     <w:p>
@@ -4951,17 +5782,17 @@
         </w:pict>
       </w:r>
     </w:p>
-    <w:bookmarkEnd w:id="57"/>
-    <w:bookmarkStart w:id="61" w:name="plany-rozbudowy-v2.0"/>
+    <w:bookmarkEnd w:id="60"/>
+    <w:bookmarkStart w:id="64" w:name="plany-rozbudowy-v2.0-osoba-1-osoba-2"/>
     <w:p>
       <w:pPr>
         <w:pStyle w:val="Heading2"/>
       </w:pPr>
       <w:r>
-        <w:t xml:space="preserve">9. Plany rozbudowy (v2.0)</w:t>
-      </w:r>
-    </w:p>
-    <w:bookmarkStart w:id="58" w:name="czego-brakuje-w-v1.0"/>
+        <w:t xml:space="preserve">9. Plany rozbudowy (v2.0) — (Osoba 1 + Osoba 2)</w:t>
+      </w:r>
+    </w:p>
+    <w:bookmarkStart w:id="61" w:name="czego-brakuje-w-v1.0"/>
     <w:p>
       <w:pPr>
         <w:pStyle w:val="Heading3"/>
@@ -4974,7 +5805,7 @@
       <w:pPr>
         <w:numPr>
           <w:ilvl w:val="0"/>
-          <w:numId w:val="1012"/>
+          <w:numId w:val="1015"/>
         </w:numPr>
         <w:pStyle w:val="Compact"/>
       </w:pPr>
@@ -4986,7 +5817,7 @@
       <w:pPr>
         <w:numPr>
           <w:ilvl w:val="0"/>
-          <w:numId w:val="1012"/>
+          <w:numId w:val="1015"/>
         </w:numPr>
         <w:pStyle w:val="Compact"/>
       </w:pPr>
@@ -4998,7 +5829,7 @@
       <w:pPr>
         <w:numPr>
           <w:ilvl w:val="0"/>
-          <w:numId w:val="1012"/>
+          <w:numId w:val="1015"/>
         </w:numPr>
         <w:pStyle w:val="Compact"/>
       </w:pPr>
@@ -5006,8 +5837,8 @@
         <w:t xml:space="preserve">Oznaczanie przelewów jako wykonanych (rozliczanie sald).</w:t>
       </w:r>
     </w:p>
-    <w:bookmarkEnd w:id="58"/>
-    <w:bookmarkStart w:id="59" w:name="potencjalne-v2.0"/>
+    <w:bookmarkEnd w:id="61"/>
+    <w:bookmarkStart w:id="62" w:name="potencjalne-v2.0"/>
     <w:p>
       <w:pPr>
         <w:pStyle w:val="Heading3"/>
@@ -5020,7 +5851,7 @@
       <w:pPr>
         <w:numPr>
           <w:ilvl w:val="0"/>
-          <w:numId w:val="1013"/>
+          <w:numId w:val="1016"/>
         </w:numPr>
         <w:pStyle w:val="Compact"/>
       </w:pPr>
@@ -5032,7 +5863,7 @@
       <w:pPr>
         <w:numPr>
           <w:ilvl w:val="0"/>
-          <w:numId w:val="1013"/>
+          <w:numId w:val="1016"/>
         </w:numPr>
         <w:pStyle w:val="Compact"/>
       </w:pPr>
@@ -5044,7 +5875,7 @@
       <w:pPr>
         <w:numPr>
           <w:ilvl w:val="0"/>
-          <w:numId w:val="1013"/>
+          <w:numId w:val="1016"/>
         </w:numPr>
         <w:pStyle w:val="Compact"/>
       </w:pPr>
@@ -5056,7 +5887,7 @@
       <w:pPr>
         <w:numPr>
           <w:ilvl w:val="0"/>
-          <w:numId w:val="1013"/>
+          <w:numId w:val="1016"/>
         </w:numPr>
         <w:pStyle w:val="Compact"/>
       </w:pPr>
@@ -5064,8 +5895,8 @@
         <w:t xml:space="preserve">Wdrożenie produkcyjne na MySQL z aktywnymi triggerami i funkcją SQL.</w:t>
       </w:r>
     </w:p>
-    <w:bookmarkEnd w:id="59"/>
-    <w:bookmarkStart w:id="60" w:name="optymalizacje"/>
+    <w:bookmarkEnd w:id="62"/>
+    <w:bookmarkStart w:id="63" w:name="optymalizacje"/>
     <w:p>
       <w:pPr>
         <w:pStyle w:val="Heading3"/>
@@ -5078,7 +5909,7 @@
       <w:pPr>
         <w:numPr>
           <w:ilvl w:val="0"/>
-          <w:numId w:val="1014"/>
+          <w:numId w:val="1017"/>
         </w:numPr>
         <w:pStyle w:val="Compact"/>
       </w:pPr>
@@ -5117,7 +5948,7 @@
       <w:pPr>
         <w:numPr>
           <w:ilvl w:val="0"/>
-          <w:numId w:val="1014"/>
+          <w:numId w:val="1017"/>
         </w:numPr>
         <w:pStyle w:val="Compact"/>
       </w:pPr>
@@ -5129,7 +5960,7 @@
       <w:pPr>
         <w:numPr>
           <w:ilvl w:val="0"/>
-          <w:numId w:val="1014"/>
+          <w:numId w:val="1017"/>
         </w:numPr>
         <w:pStyle w:val="Compact"/>
       </w:pPr>
@@ -5137,9 +5968,9 @@
         <w:t xml:space="preserve">Kolejka (queue) do wysyłki powiadomień.</w:t>
       </w:r>
     </w:p>
-    <w:bookmarkEnd w:id="60"/>
-    <w:bookmarkEnd w:id="61"/>
-    <w:bookmarkEnd w:id="62"/>
+    <w:bookmarkEnd w:id="63"/>
+    <w:bookmarkEnd w:id="64"/>
+    <w:bookmarkEnd w:id="65"/>
     <w:sectPr/>
   </w:body>
 </w:document>
@@ -5502,6 +6333,15 @@
     <w:abstractNumId w:val="991"/>
   </w:num>
   <w:num w:numId="1003">
+    <w:abstractNumId w:val="991"/>
+  </w:num>
+  <w:num w:numId="1004">
+    <w:abstractNumId w:val="991"/>
+  </w:num>
+  <w:num w:numId="1005">
+    <w:abstractNumId w:val="991"/>
+  </w:num>
+  <w:num w:numId="1006">
     <w:abstractNumId w:val="99411"/>
     <w:lvlOverride w:ilvl="0">
       <w:startOverride w:val="1"/>
@@ -5531,7 +6371,7 @@
       <w:startOverride w:val="1"/>
     </w:lvlOverride>
   </w:num>
-  <w:num w:numId="1004">
+  <w:num w:numId="1007">
     <w:abstractNumId w:val="99417"/>
     <w:lvlOverride w:ilvl="0">
       <w:startOverride w:val="7"/>
@@ -5561,15 +6401,6 @@
       <w:startOverride w:val="7"/>
     </w:lvlOverride>
   </w:num>
-  <w:num w:numId="1005">
-    <w:abstractNumId w:val="991"/>
-  </w:num>
-  <w:num w:numId="1006">
-    <w:abstractNumId w:val="991"/>
-  </w:num>
-  <w:num w:numId="1007">
-    <w:abstractNumId w:val="991"/>
-  </w:num>
   <w:num w:numId="1008">
     <w:abstractNumId w:val="991"/>
   </w:num>
@@ -5589,6 +6420,15 @@
     <w:abstractNumId w:val="991"/>
   </w:num>
   <w:num w:numId="1014">
+    <w:abstractNumId w:val="991"/>
+  </w:num>
+  <w:num w:numId="1015">
+    <w:abstractNumId w:val="991"/>
+  </w:num>
+  <w:num w:numId="1016">
+    <w:abstractNumId w:val="991"/>
+  </w:num>
+  <w:num w:numId="1017">
     <w:abstractNumId w:val="991"/>
   </w:num>
 </w:numbering>

</xml_diff>